<commit_message>
remove:blank line between hinweis and extra pay that shows up when checkbox is marked in duschwanne section
</commit_message>
<xml_diff>
--- a/src/templates/Angebot-BU-KK-2.docx
+++ b/src/templates/Angebot-BU-KK-2.docx
@@ -16,13 +16,10 @@
       </w:pPr>
       <w:r>
         <w:rPr/>
-        <w:br/>
-      </w:r>
-      <w:r>
         <mc:AlternateContent>
           <mc:Choice Requires="wps">
             <w:drawing>
-              <wp:anchor behindDoc="0" distT="72390" distB="72390" distL="72390" distR="72390" simplePos="0" locked="0" layoutInCell="0" allowOverlap="1" relativeHeight="5">
+              <wp:anchor behindDoc="0" distT="72390" distB="72390" distL="71755" distR="72390" simplePos="0" locked="0" layoutInCell="0" allowOverlap="1" relativeHeight="5">
                 <wp:simplePos x="0" y="0"/>
                 <wp:positionH relativeFrom="page">
                   <wp:posOffset>720090</wp:posOffset>
@@ -37,17 +34,28 @@
                 <a:graphic xmlns:a="http://schemas.openxmlformats.org/drawingml/2006/main">
                   <a:graphicData uri="http://schemas.microsoft.com/office/word/2010/wordprocessingShape">
                     <wps:wsp>
-                      <wps:cNvSpPr txBox="1"/>
+                      <wps:cNvSpPr/>
                       <wps:spPr>
                         <a:xfrm>
                           <a:off x="0" y="0"/>
-                          <a:ext cx="6332855" cy="2288540"/>
+                          <a:ext cx="6332760" cy="2288520"/>
                         </a:xfrm>
-                        <a:prstGeom prst="rect"/>
+                        <a:prstGeom prst="rect">
+                          <a:avLst/>
+                        </a:prstGeom>
                         <a:solidFill>
-                          <a:srgbClr val="FFFFFF"/>
+                          <a:srgbClr val="ffffff"/>
                         </a:solidFill>
+                        <a:ln w="0">
+                          <a:noFill/>
+                        </a:ln>
                       </wps:spPr>
+                      <wps:style>
+                        <a:lnRef idx="0"/>
+                        <a:fillRef idx="0"/>
+                        <a:effectRef idx="0"/>
+                        <a:fontRef idx="minor"/>
+                      </wps:style>
                       <wps:txbx>
                         <w:txbxContent>
                           <w:p>
@@ -117,8 +125,8 @@
                               <w:tblLook w:val="04a0" w:noVBand="1" w:noHBand="0" w:lastColumn="0" w:firstColumn="1" w:lastRow="0" w:firstRow="1"/>
                             </w:tblPr>
                             <w:tblGrid>
-                              <w:gridCol w:w="4799"/>
-                              <w:gridCol w:w="2401"/>
+                              <w:gridCol w:w="4798"/>
+                              <w:gridCol w:w="2402"/>
                               <w:gridCol w:w="2835"/>
                             </w:tblGrid>
                             <w:tr>
@@ -127,7 +135,7 @@
                               </w:trPr>
                               <w:tc>
                                 <w:tcPr>
-                                  <w:tcW w:w="4799" w:type="dxa"/>
+                                  <w:tcW w:w="4798" w:type="dxa"/>
                                   <w:tcBorders>
                                     <w:top w:val="single" w:sz="8" w:space="0" w:color="FFFFFF"/>
                                     <w:left w:val="single" w:sz="8" w:space="0" w:color="FFFFFF"/>
@@ -231,7 +239,7 @@
                               </w:tc>
                               <w:tc>
                                 <w:tcPr>
-                                  <w:tcW w:w="2401" w:type="dxa"/>
+                                  <w:tcW w:w="2402" w:type="dxa"/>
                                   <w:tcBorders>
                                     <w:top w:val="single" w:sz="8" w:space="0" w:color="FFFFFF"/>
                                     <w:left w:val="single" w:sz="8" w:space="0" w:color="FFFFFF"/>
@@ -622,17 +630,12 @@
                               </w:rPr>
                             </w:pPr>
                             <w:r>
-                              <w:rPr>
-                                <w:rFonts w:eastAsia="Open Sans" w:cs="Open Sans" w:ascii="Open Sans" w:hAnsi="Open Sans"/>
-                                <w:color w:val="070707"/>
-                                <w:sz w:val="17"/>
-                                <w:szCs w:val="17"/>
-                              </w:rPr>
+                              <w:rPr/>
                             </w:r>
                           </w:p>
                         </w:txbxContent>
                       </wps:txbx>
-                      <wps:bodyPr anchor="t" lIns="0" tIns="0" rIns="0" bIns="0">
+                      <wps:bodyPr lIns="0" rIns="0" tIns="0" bIns="0" anchor="t">
                         <a:noAutofit/>
                       </wps:bodyPr>
                     </wps:wsp>
@@ -643,8 +646,10 @@
           </mc:Choice>
           <mc:Fallback>
             <w:pict>
-              <v:rect style="position:absolute;rotation:-0;width:498.65pt;height:180.2pt;mso-wrap-distance-left:5.7pt;mso-wrap-distance-right:5.7pt;mso-wrap-distance-top:5.7pt;mso-wrap-distance-bottom:5.7pt;margin-top:116.2pt;mso-position-vertical-relative:page;margin-left:56.7pt;mso-position-horizontal-relative:page">
-                <v:textbox inset="0in,0in,0in,0in">
+              <v:rect id="shape_0" ID="Frame1" path="m0,0l-2147483645,0l-2147483645,-2147483646l0,-2147483646xe" fillcolor="white" stroked="f" o:allowincell="f" style="position:absolute;margin-left:56.7pt;margin-top:116.2pt;width:498.6pt;height:180.15pt;mso-wrap-style:square;v-text-anchor:top;mso-position-horizontal-relative:page;mso-position-vertical-relative:page">
+                <v:fill o:detectmouseclick="t" type="solid" color2="black"/>
+                <v:stroke color="#3465a4" joinstyle="round" endcap="flat"/>
+                <v:textbox>
                   <w:txbxContent>
                     <w:p>
                       <w:pPr>
@@ -713,8 +718,8 @@
                         <w:tblLook w:val="04a0" w:noVBand="1" w:noHBand="0" w:lastColumn="0" w:firstColumn="1" w:lastRow="0" w:firstRow="1"/>
                       </w:tblPr>
                       <w:tblGrid>
-                        <w:gridCol w:w="4799"/>
-                        <w:gridCol w:w="2401"/>
+                        <w:gridCol w:w="4798"/>
+                        <w:gridCol w:w="2402"/>
                         <w:gridCol w:w="2835"/>
                       </w:tblGrid>
                       <w:tr>
@@ -723,7 +728,7 @@
                         </w:trPr>
                         <w:tc>
                           <w:tcPr>
-                            <w:tcW w:w="4799" w:type="dxa"/>
+                            <w:tcW w:w="4798" w:type="dxa"/>
                             <w:tcBorders>
                               <w:top w:val="single" w:sz="8" w:space="0" w:color="FFFFFF"/>
                               <w:left w:val="single" w:sz="8" w:space="0" w:color="FFFFFF"/>
@@ -827,7 +832,7 @@
                         </w:tc>
                         <w:tc>
                           <w:tcPr>
-                            <w:tcW w:w="2401" w:type="dxa"/>
+                            <w:tcW w:w="2402" w:type="dxa"/>
                             <w:tcBorders>
                               <w:top w:val="single" w:sz="8" w:space="0" w:color="FFFFFF"/>
                               <w:left w:val="single" w:sz="8" w:space="0" w:color="FFFFFF"/>
@@ -1218,12 +1223,7 @@
                         </w:rPr>
                       </w:pPr>
                       <w:r>
-                        <w:rPr>
-                          <w:rFonts w:eastAsia="Open Sans" w:cs="Open Sans" w:ascii="Open Sans" w:hAnsi="Open Sans"/>
-                          <w:color w:val="070707"/>
-                          <w:sz w:val="17"/>
-                          <w:szCs w:val="17"/>
-                        </w:rPr>
+                        <w:rPr/>
                       </w:r>
                     </w:p>
                   </w:txbxContent>
@@ -1233,6 +1233,10 @@
             </w:pict>
           </mc:Fallback>
         </mc:AlternateContent>
+      </w:r>
+      <w:r>
+        <w:rPr/>
+        <w:br/>
       </w:r>
     </w:p>
     <w:p>
@@ -1338,9 +1342,9 @@
         <w:tblLook w:val="04a0" w:noVBand="1" w:noHBand="0" w:lastColumn="0" w:firstColumn="1" w:lastRow="0" w:firstRow="1"/>
       </w:tblPr>
       <w:tblGrid>
-        <w:gridCol w:w="499"/>
+        <w:gridCol w:w="498"/>
         <w:gridCol w:w="840"/>
-        <w:gridCol w:w="5495"/>
+        <w:gridCol w:w="5496"/>
         <w:gridCol w:w="1353"/>
         <w:gridCol w:w="1156"/>
       </w:tblGrid>
@@ -1350,7 +1354,7 @@
         </w:trPr>
         <w:tc>
           <w:tcPr>
-            <w:tcW w:w="499" w:type="dxa"/>
+            <w:tcW w:w="498" w:type="dxa"/>
             <w:tcBorders/>
             <w:shd w:color="auto" w:fill="CCCCCC" w:val="clear"/>
           </w:tcPr>
@@ -1404,7 +1408,7 @@
         </w:tc>
         <w:tc>
           <w:tcPr>
-            <w:tcW w:w="5495" w:type="dxa"/>
+            <w:tcW w:w="5496" w:type="dxa"/>
             <w:tcBorders/>
             <w:shd w:color="auto" w:fill="CCCCCC" w:val="clear"/>
           </w:tcPr>
@@ -1491,7 +1495,7 @@
         </w:trPr>
         <w:tc>
           <w:tcPr>
-            <w:tcW w:w="499" w:type="dxa"/>
+            <w:tcW w:w="498" w:type="dxa"/>
             <w:tcBorders/>
             <w:shd w:color="auto" w:fill="FFFFFF" w:val="clear"/>
           </w:tcPr>
@@ -1549,7 +1553,7 @@
         </w:tc>
         <w:tc>
           <w:tcPr>
-            <w:tcW w:w="5495" w:type="dxa"/>
+            <w:tcW w:w="5496" w:type="dxa"/>
             <w:tcBorders/>
             <w:shd w:color="auto" w:fill="FFFFFF" w:val="clear"/>
           </w:tcPr>
@@ -1637,7 +1641,7 @@
         </w:trPr>
         <w:tc>
           <w:tcPr>
-            <w:tcW w:w="499" w:type="dxa"/>
+            <w:tcW w:w="498" w:type="dxa"/>
             <w:tcBorders/>
             <w:shd w:color="auto" w:fill="FFFFFF" w:val="clear"/>
             <w:tcMar>
@@ -1728,7 +1732,7 @@
         </w:tc>
         <w:tc>
           <w:tcPr>
-            <w:tcW w:w="5495" w:type="dxa"/>
+            <w:tcW w:w="5496" w:type="dxa"/>
             <w:tcBorders/>
             <w:shd w:color="auto" w:fill="FFFFFF" w:val="clear"/>
             <w:tcMar>
@@ -2044,10 +2048,10 @@
       </w:tblPr>
       <w:tblGrid>
         <w:gridCol w:w="479"/>
-        <w:gridCol w:w="831"/>
-        <w:gridCol w:w="5501"/>
-        <w:gridCol w:w="1352"/>
-        <w:gridCol w:w="1180"/>
+        <w:gridCol w:w="830"/>
+        <w:gridCol w:w="5502"/>
+        <w:gridCol w:w="1351"/>
+        <w:gridCol w:w="1181"/>
       </w:tblGrid>
       <w:tr>
         <w:trPr>
@@ -2089,7 +2093,7 @@
         </w:tc>
         <w:tc>
           <w:tcPr>
-            <w:tcW w:w="831" w:type="dxa"/>
+            <w:tcW w:w="830" w:type="dxa"/>
             <w:tcBorders/>
             <w:shd w:color="auto" w:fill="FFFFFF" w:val="clear"/>
           </w:tcPr>
@@ -2123,7 +2127,7 @@
         </w:tc>
         <w:tc>
           <w:tcPr>
-            <w:tcW w:w="5501" w:type="dxa"/>
+            <w:tcW w:w="5502" w:type="dxa"/>
             <w:tcBorders/>
             <w:shd w:color="auto" w:fill="FFFFFF" w:val="clear"/>
           </w:tcPr>
@@ -2161,7 +2165,7 @@
         </w:tc>
         <w:tc>
           <w:tcPr>
-            <w:tcW w:w="1352" w:type="dxa"/>
+            <w:tcW w:w="1351" w:type="dxa"/>
             <w:tcBorders/>
             <w:shd w:color="auto" w:fill="FFFFFF" w:val="clear"/>
           </w:tcPr>
@@ -2193,7 +2197,7 @@
         </w:tc>
         <w:tc>
           <w:tcPr>
-            <w:tcW w:w="1180" w:type="dxa"/>
+            <w:tcW w:w="1181" w:type="dxa"/>
             <w:tcBorders/>
             <w:shd w:color="auto" w:fill="FFFFFF" w:val="clear"/>
             <w:tcMar>
@@ -2257,7 +2261,7 @@
         </w:tc>
         <w:tc>
           <w:tcPr>
-            <w:tcW w:w="831" w:type="dxa"/>
+            <w:tcW w:w="830" w:type="dxa"/>
             <w:tcBorders/>
             <w:shd w:color="auto" w:fill="FFFFFF" w:val="clear"/>
           </w:tcPr>
@@ -2282,7 +2286,7 @@
         </w:tc>
         <w:tc>
           <w:tcPr>
-            <w:tcW w:w="5501" w:type="dxa"/>
+            <w:tcW w:w="5502" w:type="dxa"/>
             <w:tcBorders/>
             <w:shd w:color="auto" w:fill="FFFFFF" w:val="clear"/>
           </w:tcPr>
@@ -2459,7 +2463,7 @@
         </w:tc>
         <w:tc>
           <w:tcPr>
-            <w:tcW w:w="1352" w:type="dxa"/>
+            <w:tcW w:w="1351" w:type="dxa"/>
             <w:tcBorders/>
             <w:shd w:color="auto" w:fill="FFFFFF" w:val="clear"/>
           </w:tcPr>
@@ -2485,7 +2489,7 @@
         </w:tc>
         <w:tc>
           <w:tcPr>
-            <w:tcW w:w="1180" w:type="dxa"/>
+            <w:tcW w:w="1181" w:type="dxa"/>
             <w:tcBorders/>
             <w:shd w:color="auto" w:fill="FFFFFF" w:val="clear"/>
             <w:vAlign w:val="center"/>
@@ -2552,7 +2556,7 @@
         </w:tc>
         <w:tc>
           <w:tcPr>
-            <w:tcW w:w="831" w:type="dxa"/>
+            <w:tcW w:w="830" w:type="dxa"/>
             <w:tcBorders/>
             <w:shd w:color="auto" w:fill="FFFFFF" w:val="clear"/>
           </w:tcPr>
@@ -2586,7 +2590,7 @@
         </w:tc>
         <w:tc>
           <w:tcPr>
-            <w:tcW w:w="5501" w:type="dxa"/>
+            <w:tcW w:w="5502" w:type="dxa"/>
             <w:tcBorders/>
             <w:shd w:color="auto" w:fill="FFFFFF" w:val="clear"/>
           </w:tcPr>
@@ -2647,7 +2651,7 @@
         </w:tc>
         <w:tc>
           <w:tcPr>
-            <w:tcW w:w="1352" w:type="dxa"/>
+            <w:tcW w:w="1351" w:type="dxa"/>
             <w:tcBorders/>
             <w:shd w:color="auto" w:fill="FFFFFF" w:val="clear"/>
           </w:tcPr>
@@ -2677,7 +2681,7 @@
         </w:tc>
         <w:tc>
           <w:tcPr>
-            <w:tcW w:w="1180" w:type="dxa"/>
+            <w:tcW w:w="1181" w:type="dxa"/>
             <w:tcBorders/>
             <w:shd w:color="auto" w:fill="FFFFFF" w:val="clear"/>
           </w:tcPr>
@@ -3051,10 +3055,20 @@
       <w:r>
         <w:rPr>
           <w:rFonts w:eastAsia="Open Sans Semibold" w:cs="Open Sans Semibold" w:ascii="Open Sans Semibold" w:hAnsi="Open Sans Semibold"/>
+          <w:b/>
+          <w:bCs/>
           <w:color w:val="030303"/>
           <w:lang w:val="de-DE"/>
         </w:rPr>
-        <w:t>HINWEIS:</w:t>
+        <w:t>HINWEIS</w:t>
+      </w:r>
+      <w:r>
+        <w:rPr>
+          <w:rFonts w:eastAsia="Open Sans Semibold" w:cs="Open Sans Semibold" w:ascii="Open Sans Semibold" w:hAnsi="Open Sans Semibold"/>
+          <w:color w:val="030303"/>
+          <w:lang w:val="de-DE"/>
+        </w:rPr>
+        <w:t>:</w:t>
       </w:r>
       <w:r>
         <w:rPr>
@@ -3063,12 +3077,6 @@
           <w:lang w:val="de-DE"/>
         </w:rPr>
         <w:t xml:space="preserve"> Ob eine ebenerdige Montage der Duschwanne möglich ist, kann erst nach dem Ausbau der bestehenden Wanne beurteilen werden. Sollten dabei zusätzliche oder weitere Leistungen erforderlich oder von Ihnen gewünscht sein, können zusätzliche Kosten entstehen.{/EbenerdigHinweis}</w:t>
-      </w:r>
-      <w:r>
-        <w:rPr>
-          <w:lang w:val="de-DE"/>
-        </w:rPr>
-        <w:br/>
       </w:r>
     </w:p>
     <w:p>
@@ -3148,18 +3156,12 @@
         <w:spacing w:lineRule="auto" w:line="283"/>
         <w:ind w:left="125" w:right="1024"/>
         <w:rPr>
-          <w:rFonts w:ascii="Open Sans" w:hAnsi="Open Sans" w:eastAsia="Open Sans" w:cs="Open Sans"/>
-          <w:b/>
-          <w:bCs/>
-          <w:i/>
-          <w:i/>
-          <w:iCs/>
-          <w:color w:val="030303"/>
-          <w:lang w:val="de-DE"/>
+          <w:rFonts w:ascii="Open Sans" w:hAnsi="Open Sans"/>
         </w:rPr>
       </w:pPr>
       <w:r>
         <w:rPr>
+          <w:rFonts w:ascii="Open Sans" w:hAnsi="Open Sans"/>
           <w:lang w:val="de-DE"/>
         </w:rPr>
         <w:t>{#SelfPayLines}</w:t>
@@ -3168,6 +3170,7 @@
       </w:r>
       <w:r>
         <w:rPr>
+          <w:rFonts w:ascii="Open Sans" w:hAnsi="Open Sans"/>
           <w:b/>
           <w:lang w:val="de-DE"/>
         </w:rPr>
@@ -3175,6 +3178,7 @@
       </w:r>
       <w:r>
         <w:rPr>
+          <w:rFonts w:ascii="Open Sans" w:hAnsi="Open Sans"/>
           <w:lang w:val="de-DE"/>
         </w:rPr>
         <w:t>{/IsTitle}{^IsTitle}{Text}{/IsTitle}{/SelfPayLines}</w:t>
@@ -3185,11 +3189,7 @@
         <w:pStyle w:val="Normal"/>
         <w:spacing w:lineRule="auto" w:line="286" w:before="215" w:after="0"/>
         <w:ind w:left="123" w:right="222"/>
-        <w:rPr>
-          <w:rFonts w:ascii="Open Sans" w:hAnsi="Open Sans" w:eastAsia="Open Sans" w:cs="Open Sans"/>
-          <w:color w:val="000000"/>
-          <w:lang w:val="de-DE"/>
-        </w:rPr>
+        <w:rPr/>
       </w:pPr>
       <w:r>
         <w:rPr>
@@ -3531,8 +3531,8 @@
       <w:tblLook w:val="04a0" w:noVBand="1" w:noHBand="0" w:lastColumn="0" w:firstColumn="1" w:lastRow="0" w:firstRow="1"/>
     </w:tblPr>
     <w:tblGrid>
-      <w:gridCol w:w="8064"/>
-      <w:gridCol w:w="1820"/>
+      <w:gridCol w:w="8065"/>
+      <w:gridCol w:w="1819"/>
     </w:tblGrid>
     <w:tr>
       <w:trPr>
@@ -3540,7 +3540,7 @@
       </w:trPr>
       <w:tc>
         <w:tcPr>
-          <w:tcW w:w="8064" w:type="dxa"/>
+          <w:tcW w:w="8065" w:type="dxa"/>
           <w:tcBorders>
             <w:top w:val="single" w:sz="8" w:space="0" w:color="FFFFFF"/>
             <w:left w:val="single" w:sz="8" w:space="0" w:color="FFFFFF"/>
@@ -3627,7 +3627,7 @@
       </w:tc>
       <w:tc>
         <w:tcPr>
-          <w:tcW w:w="1820" w:type="dxa"/>
+          <w:tcW w:w="1819" w:type="dxa"/>
           <w:tcBorders>
             <w:top w:val="single" w:sz="8" w:space="0" w:color="FFFFFF"/>
             <w:left w:val="single" w:sz="8" w:space="0" w:color="FFFFFF"/>
@@ -3822,8 +3822,8 @@
       <w:tblLook w:val="04a0" w:noVBand="1" w:noHBand="0" w:lastColumn="0" w:firstColumn="1" w:lastRow="0" w:firstRow="1"/>
     </w:tblPr>
     <w:tblGrid>
-      <w:gridCol w:w="8064"/>
-      <w:gridCol w:w="1820"/>
+      <w:gridCol w:w="8065"/>
+      <w:gridCol w:w="1819"/>
     </w:tblGrid>
     <w:tr>
       <w:trPr>
@@ -3831,7 +3831,7 @@
       </w:trPr>
       <w:tc>
         <w:tcPr>
-          <w:tcW w:w="8064" w:type="dxa"/>
+          <w:tcW w:w="8065" w:type="dxa"/>
           <w:tcBorders>
             <w:top w:val="single" w:sz="8" w:space="0" w:color="FFFFFF"/>
             <w:left w:val="single" w:sz="8" w:space="0" w:color="FFFFFF"/>
@@ -3918,7 +3918,7 @@
       </w:tc>
       <w:tc>
         <w:tcPr>
-          <w:tcW w:w="1820" w:type="dxa"/>
+          <w:tcW w:w="1819" w:type="dxa"/>
           <w:tcBorders>
             <w:top w:val="single" w:sz="8" w:space="0" w:color="FFFFFF"/>
             <w:left w:val="single" w:sz="8" w:space="0" w:color="FFFFFF"/>
@@ -5013,6 +5013,13 @@
       <w:bCs/>
     </w:rPr>
   </w:style>
+  <w:style w:type="paragraph" w:styleId="FrameContentsuser">
+    <w:name w:val="Frame Contents (user)"/>
+    <w:basedOn w:val="Normal"/>
+    <w:qFormat/>
+    <w:pPr/>
+    <w:rPr/>
+  </w:style>
   <w:style w:type="paragraph" w:styleId="FrameContents">
     <w:name w:val="Frame Contents"/>
     <w:basedOn w:val="Normal"/>

</xml_diff>